<commit_message>
Phase 6: complete — documentation, LICENSE, GitHub templates
- LICENSE: MIT, Sean Patrick Morris 2026
- .github/ISSUE_TEMPLATE/bug_report.md: structured bug report template
  covering all pipeline components, environment fields, and error output
- Corrected vocabulary term count to 36,125 (actual embedded count)
  across README.md, CHANGELOG.md, READING_THE_TERRAIN_V2, and
  CRITICAL_FRAMEWORK_V2; regenerated .docx files

All checks passed: 36,125 embeddings, 546 probe_discovery journal entries
(max desert 0.9329), 21 pipeline scripts, 6 doc files, frontend build
clean (0 TypeScript errors).

Co-Authored-By: Claude Sonnet 4.6 <noreply@anthropic.com>
</commit_message>
<xml_diff>
--- a/docs/READING_THE_TERRAIN_V2.docx
+++ b/docs/READING_THE_TERRAIN_V2.docx
@@ -77,7 +77,7 @@
         <w:rPr>
           <w:sz w:val="22"/>
         </w:rPr>
-        <w:t xml:space="preserve"> is the macro navigation — the full terrain with all 36,102 concept points, coloured by Roget class, animated by gradient flow. </w:t>
+        <w:t xml:space="preserve"> is the macro navigation — the full terrain with all 36,125 concept points, coloured by Roget class, animated by gradient flow. </w:t>
       </w:r>
       <w:r>
         <w:rPr>
@@ -155,7 +155,7 @@
         <w:rPr>
           <w:sz w:val="22"/>
         </w:rPr>
-        <w:t>The heightfield is computed from a 2D kernel density estimate over the UMAP-projected positions of all 36,102 concept terms. It is rendered as a Three.js mesh with the z-axis set to KDE density value.</w:t>
+        <w:t>The heightfield is computed from a 2D kernel density estimate over the UMAP-projected positions of all 36,125 concept terms. It is rendered as a Three.js mesh with the z-axis set to KDE density value.</w:t>
       </w:r>
     </w:p>
     <w:p>
@@ -2588,7 +2588,7 @@
               <w:rPr>
                 <w:sz w:val="22"/>
               </w:rPr>
-              <w:t>36,102 terms</w:t>
+              <w:t>36,125 terms</w:t>
             </w:r>
           </w:p>
         </w:tc>

</xml_diff>